<commit_message>
Rewrite landing content and restore brand assets
</commit_message>
<xml_diff>
--- a/docs/ТЗ_АСПЛН_Tilda.docx
+++ b/docs/ТЗ_АСПЛН_Tilda.docx
@@ -17,7 +17,7 @@
         <w:pStyle w:val="Title"/>
       </w:pPr>
       <w:r>
-        <w:t>АСПЛН — техническое задание</w:t>
+        <w:t>АСПЛН - техническое задание</w:t>
       </w:r>
     </w:p>
     <w:p>
@@ -328,7 +328,7 @@
     </w:p>
     <w:p>
       <w:r>
-        <w:t>Проект: АСПЛН. Объём: 2 страницы. Новая версия не копирует основной сайт клиники, а решает самостоятельную задачу внутри единой экосистемы.</w:t>
+        <w:t>Проект: АСПЛН. Объем: 2 страницы. У лендинга самостоятельная задача и единая визуальная связь с сайтом клиники.</w:t>
       </w:r>
     </w:p>
     <w:tbl>
@@ -476,7 +476,7 @@
                 <w:color w:val="3D3D39"/>
                 <w:sz w:val="16"/>
               </w:rPr>
-              <w:t>врачи, научные сотрудники, реабилитологи, медицинские организации и партнёры</w:t>
+              <w:t>врачи, научные сотрудники, реабилитологи, медицинские организации и партнеры</w:t>
             </w:r>
           </w:p>
         </w:tc>
@@ -680,7 +680,7 @@
         <w:pStyle w:val="ListBullet"/>
       </w:pPr>
       <w:r>
-        <w:t>Специалист понимает миссию и пользу участия → изучает условия → подаёт заявку.</w:t>
+        <w:t>Специалист понимает миссию и пользу участия → изучает условия → подает заявку.</w:t>
       </w:r>
     </w:p>
     <w:p>
@@ -688,7 +688,7 @@
         <w:pStyle w:val="ListBullet"/>
       </w:pPr>
       <w:r>
-        <w:t>Партнёр проверяет фактическую деятельность → предлагает совместный проект.</w:t>
+        <w:t>Партнер проверяет фактическую деятельность → предлагает совместный проект.</w:t>
       </w:r>
     </w:p>
     <w:p>
@@ -1087,7 +1087,7 @@
                 <w:color w:val="3D3D39"/>
                 <w:sz w:val="16"/>
               </w:rPr>
-              <w:t>Тёплый акцент</w:t>
+              <w:t>Теплый акцент</w:t>
             </w:r>
           </w:p>
         </w:tc>
@@ -1129,7 +1129,7 @@
                 <w:color w:val="3D3D39"/>
                 <w:sz w:val="16"/>
               </w:rPr>
-              <w:t>Только на тёмно-зелёных секциях</w:t>
+              <w:t>Только на темно-зеленых секциях</w:t>
             </w:r>
           </w:p>
         </w:tc>
@@ -1213,7 +1213,7 @@
         <w:pStyle w:val="ListBullet"/>
       </w:pPr>
       <w:r>
-        <w:t>Скругления карточек 20–28 px, кнопки капсульные.</w:t>
+        <w:t>Скругления карточек 20-28 px, кнопки капсульные.</w:t>
       </w:r>
     </w:p>
     <w:p>
@@ -1221,7 +1221,7 @@
         <w:pStyle w:val="ListBullet"/>
       </w:pPr>
       <w:r>
-        <w:t>Фотографии — документальные, естественный свет; не использовать стоковые изображения процедур без проверки.</w:t>
+        <w:t>Фотографии - документальные, естественный свет; не использовать стоковые изображения процедур без проверки.</w:t>
       </w:r>
     </w:p>
     <w:p>
@@ -1229,7 +1229,7 @@
         <w:pStyle w:val="ListBullet"/>
       </w:pPr>
       <w:r>
-        <w:t>На тёмном фоне обеспечить контраст не ниже WCAG AA.</w:t>
+        <w:t>На темном фоне обеспечить контраст не ниже WCAG AA.</w:t>
       </w:r>
     </w:p>
     <w:p>
@@ -1616,7 +1616,7 @@
         <w:pStyle w:val="Heading2"/>
       </w:pPr>
       <w:r>
-        <w:t>5.1. Главная — об ассоциации</w:t>
+        <w:t>5.1. Главная - об ассоциации</w:t>
       </w:r>
     </w:p>
     <w:p>
@@ -2140,7 +2140,7 @@
                 <w:color w:val="3D3D39"/>
                 <w:sz w:val="16"/>
               </w:rPr>
-              <w:t>—</w:t>
+              <w:t>-</w:t>
             </w:r>
           </w:p>
         </w:tc>
@@ -2251,7 +2251,7 @@
                 <w:color w:val="3D3D39"/>
                 <w:sz w:val="16"/>
               </w:rPr>
-              <w:t>Образование, наука, методология, сообщество, просвещение, партнёрства.</w:t>
+              <w:t>Образование, наука, методология, сообщество, просвещение, партнерства.</w:t>
             </w:r>
           </w:p>
         </w:tc>
@@ -2273,7 +2273,7 @@
                 <w:color w:val="3D3D39"/>
                 <w:sz w:val="16"/>
               </w:rPr>
-              <w:t>—</w:t>
+              <w:t>-</w:t>
             </w:r>
           </w:p>
         </w:tc>
@@ -2423,7 +2423,7 @@
                 <w:color w:val="3D3D39"/>
                 <w:sz w:val="16"/>
               </w:rPr>
-              <w:t>Подтверждённые преимущества</w:t>
+              <w:t>Подтвержденные преимущества</w:t>
             </w:r>
           </w:p>
         </w:tc>
@@ -2513,7 +2513,7 @@
                 <w:color w:val="3D3D39"/>
                 <w:sz w:val="16"/>
               </w:rPr>
-              <w:t>Д.К. Юдин и ключевые специалисты; только подтверждённые должности.</w:t>
+              <w:t>Д.К. Юдин и ключевые специалисты; только подтвержденные должности.</w:t>
             </w:r>
           </w:p>
         </w:tc>
@@ -2797,7 +2797,7 @@
                 <w:color w:val="3D3D39"/>
                 <w:sz w:val="16"/>
               </w:rPr>
-              <w:t>—</w:t>
+              <w:t>-</w:t>
             </w:r>
           </w:p>
         </w:tc>
@@ -3059,7 +3059,7 @@
                 <w:color w:val="3D3D39"/>
                 <w:sz w:val="16"/>
               </w:rPr>
-              <w:t>—</w:t>
+              <w:t>-</w:t>
             </w:r>
           </w:p>
         </w:tc>
@@ -3102,7 +3102,7 @@
     </w:p>
     <w:p>
       <w:r>
-        <w:t>Подтвердить реальную работу ассоциации фактами, материалами и календарём.</w:t>
+        <w:t>Подтвердить реальную работу ассоциации фактами, материалами и календарем.</w:t>
       </w:r>
     </w:p>
     <w:tbl>
@@ -3492,7 +3492,7 @@
                 <w:color w:val="3D3D39"/>
                 <w:sz w:val="16"/>
               </w:rPr>
-              <w:t>—</w:t>
+              <w:t>-</w:t>
             </w:r>
           </w:p>
         </w:tc>
@@ -3841,7 +3841,7 @@
                 <w:color w:val="3D3D39"/>
                 <w:sz w:val="16"/>
               </w:rPr>
-              <w:t>Фотоотчёты</w:t>
+              <w:t>Фотоотчеты</w:t>
             </w:r>
           </w:p>
         </w:tc>
@@ -3883,7 +3883,7 @@
                 <w:color w:val="3D3D39"/>
                 <w:sz w:val="16"/>
               </w:rPr>
-              <w:t>—</w:t>
+              <w:t>-</w:t>
             </w:r>
           </w:p>
         </w:tc>
@@ -4124,7 +4124,7 @@
                 <w:color w:val="3D3D39"/>
                 <w:sz w:val="16"/>
               </w:rPr>
-              <w:t>Доступ к материалам, партнёрства, мероприятия.</w:t>
+              <w:t>Доступ к материалам, партнерства, мероприятия.</w:t>
             </w:r>
           </w:p>
         </w:tc>
@@ -4145,7 +4145,7 @@
                 <w:color w:val="3D3D39"/>
                 <w:sz w:val="16"/>
               </w:rPr>
-              <w:t>—</w:t>
+              <w:t>-</w:t>
             </w:r>
           </w:p>
         </w:tc>
@@ -4407,7 +4407,7 @@
                 <w:color w:val="3D3D39"/>
                 <w:sz w:val="16"/>
               </w:rPr>
-              <w:t>—</w:t>
+              <w:t>-</w:t>
             </w:r>
           </w:p>
         </w:tc>
@@ -4465,12 +4465,12 @@
         <w:pStyle w:val="Heading3"/>
       </w:pPr>
       <w:r>
-        <w:t>Партнёрское обращение</w:t>
+        <w:t>Партнерское обращение</w:t>
       </w:r>
     </w:p>
     <w:p>
       <w:r>
-        <w:t>Поля: имя, организация, контакты, тип проекта, сообщение, согласие. Маршрутизация ответственному за партнёрства.</w:t>
+        <w:t>Поля: имя, организация, контакты, тип проекта, сообщение, согласие. Маршрутизация ответственному за партнерства.</w:t>
       </w:r>
     </w:p>
     <w:p>
@@ -4658,7 +4658,7 @@
                 <w:color w:val="3D3D39"/>
                 <w:sz w:val="16"/>
               </w:rPr>
-              <w:t>АСПЛН — ассоциация специалистов патологии лицевого нерва</w:t>
+              <w:t>АСПЛН - ассоциация специалистов патологии лицевого нерва</w:t>
             </w:r>
           </w:p>
         </w:tc>
@@ -4806,7 +4806,7 @@
         <w:pStyle w:val="ListBullet"/>
       </w:pPr>
       <w:r>
-        <w:t>Один H1 на странице; последовательная H2–H3 структура.</w:t>
+        <w:t>Один H1 на странице; последовательная H2-H3 структура.</w:t>
       </w:r>
     </w:p>
     <w:p>
@@ -5575,7 +5575,7 @@
                 <w:color w:val="3D3D39"/>
                 <w:sz w:val="16"/>
               </w:rPr>
-              <w:t>Оригиналы без мессенджер-сжатия, согласия изображённых лиц, подписи и даты</w:t>
+              <w:t>Оригиналы без мессенджер-сжатия, согласия изображенных лиц, подписи и даты</w:t>
             </w:r>
           </w:p>
         </w:tc>
@@ -5839,7 +5839,7 @@
                 <w:color w:val="3D3D39"/>
                 <w:sz w:val="16"/>
               </w:rPr>
-              <w:t>Подтверждённые названия, регион, ссылки на официальные документы и профили</w:t>
+              <w:t>Подтвержденные названия, регион, ссылки на официальные документы и профили</w:t>
             </w:r>
           </w:p>
         </w:tc>
@@ -6265,7 +6265,7 @@
         <w:pStyle w:val="ListBullet"/>
       </w:pPr>
       <w:r>
-        <w:t>Не переносить нулевые счётчики и неподтверждённые отзывы.</w:t>
+        <w:t>Не переносить нулевые счетчики и неподтвержденные отзывы.</w:t>
       </w:r>
     </w:p>
     <w:p>
@@ -6297,7 +6297,7 @@
         <w:pStyle w:val="ListBullet"/>
       </w:pPr>
       <w:r>
-        <w:t>Стандартные блоки использовать там, где они покрывают задачу; Zero Block — только для уникальной композиции и без критической логики.</w:t>
+        <w:t>Стандартные блоки использовать там, где они покрывают задачу; Zero Block - только для уникальной композиции и без критической логики.</w:t>
       </w:r>
     </w:p>
     <w:p>
@@ -6305,7 +6305,7 @@
         <w:pStyle w:val="ListBullet"/>
       </w:pPr>
       <w:r>
-        <w:t>Не подключать тяжёлые библиотеки ради единичного эффекта; суммарный JS третьих сторон согласовывается.</w:t>
+        <w:t>Не подключать тяжелые библиотеки ради единичного эффекта; суммарный JS третьих сторон согласовывается.</w:t>
       </w:r>
     </w:p>
     <w:p>
@@ -6337,7 +6337,7 @@
         <w:pStyle w:val="ListBullet"/>
       </w:pPr>
       <w:r>
-        <w:t>Сохранить резервную копию проекта Tilda перед заменой действующего сайта; домен переключать после контрольной приёмки.</w:t>
+        <w:t>Сохранить резервную копию проекта Tilda перед заменой действующего сайта; домен переключать после контрольной приемки.</w:t>
       </w:r>
     </w:p>
     <w:p>
@@ -6345,7 +6345,7 @@
         <w:pStyle w:val="Heading1"/>
       </w:pPr>
       <w:r>
-        <w:t>12. Критерии приёмки</w:t>
+        <w:t>12. Критерии приемки</w:t>
       </w:r>
     </w:p>
     <w:p>
@@ -6369,7 +6369,7 @@
         <w:pStyle w:val="ListBullet"/>
       </w:pPr>
       <w:r>
-        <w:t>Формы доставляют тестовые заявки на утверждённый адрес и сохраняют источник.</w:t>
+        <w:t>Формы доставляют тестовые заявки на утвержденный адрес и сохраняют источник.</w:t>
       </w:r>
     </w:p>
     <w:p>
@@ -6385,7 +6385,7 @@
         <w:pStyle w:val="ListBullet"/>
       </w:pPr>
       <w:r>
-        <w:t>Нет горизонтального скролла, обрезанных заголовков и неработающих ссылок на 360–1440 px.</w:t>
+        <w:t>Нет горизонтального скролла, обрезанных заголовков и неработающих ссылок на 360-1440 px.</w:t>
       </w:r>
     </w:p>
     <w:p>
@@ -6417,12 +6417,12 @@
         <w:pStyle w:val="Heading1"/>
       </w:pPr>
       <w:r>
-        <w:t>13. Вне объёма</w:t>
+        <w:t>13. Вне объема</w:t>
       </w:r>
     </w:p>
     <w:p>
       <w:r>
-        <w:t>Фотосъёмка, видеосъёмка, создание логотипа, регулярное SEO/ведение рекламы, платные сервисы, CRM, телефония, юридическая экспертиза и новые функции сверх согласованной структуры выполняются отдельно.</w:t>
+        <w:t>Фотосъемка, видеосъемка, создание логотипа, регулярное SEO/ведение рекламы, платные сервисы, CRM, телефония, юридическая экспертиза и новые функции сверх согласованной структуры выполняются отдельно.</w:t>
       </w:r>
     </w:p>
     <w:p>
@@ -6462,7 +6462,7 @@
         <w:pStyle w:val="ListBullet"/>
       </w:pPr>
       <w:r>
-        <w:t>Действующий сайт проекта — для контент-аудита; спорные сведения не переносятся без подтверждения.</w:t>
+        <w:t>Действующий сайт проекта - для контент-аудита; спорные сведения не переносятся без подтверждения.</w:t>
       </w:r>
     </w:p>
     <w:p>

</xml_diff>